<commit_message>
Name the author on the manuscript
Zohreh Zakeran, with the contact address, under the title where the template's
style table puts it.

Co-Authored-By: Claude Opus 5 <noreply@anthropic.com>
Claude-Session: https://claude.ai/code/session_01KRvJwzAbBXRaKj1r8uzAnw
</commit_message>
<xml_diff>
--- a/paper/maghale.docx
+++ b/paper/maghale.docx
@@ -45,21 +45,41 @@
     <w:p>
       <w:pPr>
         <w:bidi/>
+        <w:spacing w:after="60"/>
+        <w:jc w:val="center"/>
+      </w:pPr>
+      <w:r>
+        <w:rPr>
+          <w:rFonts w:ascii="Times New Roman" w:cs="B Lotus" w:hAnsi="Times New Roman"/>
+          <w:b w:val="false"/>
+          <w:bCs w:val="false"/>
+          <w:i w:val="false"/>
+          <w:iCs w:val="false"/>
+          <w:sz w:val="26"/>
+          <w:szCs w:val="26"/>
+          <w:rtl/>
+        </w:rPr>
+        <w:t xml:space="preserve">زهره ذاکران</w:t>
+      </w:r>
+    </w:p>
+    <w:p>
+      <w:pPr>
+        <w:bidi/>
         <w:spacing w:after="240"/>
         <w:jc w:val="center"/>
       </w:pPr>
       <w:r>
         <w:rPr>
-          <w:rFonts w:ascii="Times New Roman" w:cs="B Lotus" w:hAnsi="Times New Roman"/>
-          <w:b w:val="false"/>
-          <w:bCs w:val="false"/>
-          <w:i w:val="false"/>
-          <w:iCs w:val="false"/>
-          <w:sz w:val="26"/>
-          <w:szCs w:val="26"/>
-          <w:rtl/>
-        </w:rPr>
-        <w:t xml:space="preserve">«نام و نام خانوادگی نویسنده»</w:t>
+          <w:rFonts w:ascii="Times New Roman" w:cs="Times New Roman" w:hAnsi="Times New Roman"/>
+          <w:b w:val="false"/>
+          <w:bCs w:val="false"/>
+          <w:i w:val="false"/>
+          <w:iCs w:val="false"/>
+          <w:sz w:val="24"/>
+          <w:szCs w:val="24"/>
+          <w:rtl w:val="false"/>
+        </w:rPr>
+        <w:t xml:space="preserve">zhrzkrn.eng@gmail.com</w:t>
       </w:r>
     </w:p>
     <w:p>

</xml_diff>